<commit_message>
Add verified six-model inference and complete training sources
</commit_message>
<xml_diff>
--- a/docs/台灣房屋銷售價格預測挑戰賽_正式報告.docx
+++ b/docs/台灣房屋銷售價格預測挑戰賽_正式報告.docx
@@ -11288,7 +11288,7 @@
         <w:rPr>
           <w:b w:val="0"/>
         </w:rPr>
-        <w:t>方法確定後，最終使用467,221筆有標籤資料。全量階段新增訓練一個參考單價神經網路，其餘五模型沿用保存預測向量。新神經網路重載後，對47,073筆測試交易推論核對一致，再重算神經網路路線的成交與空間修正，並與保存的另外兩路逐筆取中位數。[6]</w:t>
+        <w:t>原全量階段使用467,221筆有標籤資料，只新訓練參考單價網路，其餘五模型沿用保存預測。[6] 後續已在同機既有與全新獨立套件環境，從保存模型及轉換狀態重新執行六模型推論；47,073筆的13個完整向量及答案檔皆核對一致，沒有重新訓練。[9]</w:t>
       </w:r>
     </w:p>
     <w:p>
@@ -11374,7 +11374,7 @@
         <w:rPr>
           <w:b w:val="0"/>
         </w:rPr>
-        <w:t>GitHub提供必要來源與文件，不含課程交易表、私有模型或提交CSV。尚未完成在乾淨環境從原始train／valid重訓全部六模型並產生最終答案的端到端驗證；固定seed與檔案指紋支持追查，不能保證任意硬體重訓完全相同。</w:t>
+        <w:t>程式包另補22支原訓練／準備程式及2份設定／欄位規格，不含交易表、私有模型或CSV。歷史路徑、私有準備陣列、價格狀態與保存預測依賴保留。從原始train／valid重訓全部六模型尚未驗證；同機推論成功不保證任意硬體重訓相同。[9]</w:t>
       </w:r>
     </w:p>
     <w:p>
@@ -11488,11 +11488,22 @@
       </w:r>
     </w:p>
     <w:p>
+      <w:pPr>
+        <w:spacing w:after="40"/>
+      </w:pPr>
+      <w:r>
+        <w:rPr>
+          <w:sz w:val="19"/>
+        </w:rPr>
+        <w:t>[9] 六模型完整推論、兩套環境核對及原訓練來源補件。</w:t>
+      </w:r>
+    </w:p>
+    <w:p>
       <w:r>
         <w:rPr>
           <w:b w:val="0"/>
         </w:rPr>
-        <w:t>程式與證據入口：github.com/ziyi930108/nycu-house-price-regression（私人儲存庫，需存取權限）。</w:t>
+        <w:t>程式與證據入口：github.com/ziyi930108/nycu-house-price-regression（需權限）。</w:t>
       </w:r>
     </w:p>
     <w:sectPr>

</xml_diff>